<commit_message>
Report: add GitHub link under the byline (clickable in PDF)
</commit_message>
<xml_diff>
--- a/docs/PE6201_Tradeoff_Analysis_LIU_ZEYUAN.docx
+++ b/docs/PE6201_Tradeoff_Analysis_LIU_ZEYUAN.docx
@@ -19,7 +19,15 @@
         <w:rPr>
           <w:sz w:val="19"/>
         </w:rPr>
-        <w:t>LIU ZEYUAN · PE6201 Section B · End-of-Course Project</w:t>
+        <w:t xml:space="preserve">LIU ZEYUAN · PE6201 Section B · End-of-Course Project · Code: </w:t>
+      </w:r>
+      <w:r>
+        <w:rPr>
+          <w:color w:val="1F5FA8"/>
+          <w:sz w:val="19"/>
+          <w:u w:val="single"/>
+        </w:rPr>
+        <w:t>github.com/Lizzy-808/coachfit-cut-assistant</w:t>
       </w:r>
     </w:p>
     <w:p>

</xml_diff>

<commit_message>
Report: section 7 (what changes vs today; next step: calibrate TDEE from weigh-ins); 1,317 words
</commit_message>
<xml_diff>
--- a/docs/PE6201_Tradeoff_Analysis_LIU_ZEYUAN.docx
+++ b/docs/PE6201_Tradeoff_Analysis_LIU_ZEYUAN.docx
@@ -890,6 +890,48 @@
       </w:r>
     </w:p>
     <w:p>
+      <w:pPr>
+        <w:pStyle w:val="Heading2"/>
+      </w:pPr>
+      <w:r>
+        <w:rPr>
+          <w:color w:val="12324F"/>
+          <w:sz w:val="24"/>
+        </w:rPr>
+        <w:t>7. What changes, and what next</w:t>
+      </w:r>
+    </w:p>
+    <w:p>
+      <w:r>
+        <w:rPr>
+          <w:b/>
+          <w:sz w:val="20"/>
+        </w:rPr>
+        <w:t>Against today.</w:t>
+      </w:r>
+      <w:r>
+        <w:rPr>
+          <w:sz w:val="20"/>
+        </w:rPr>
+        <w:t xml:space="preserve"> A coach now skips the calculation or spends 5–10 minutes per client; a chatbot answers confidently and is right a third of the time. With the tool, every client is checked the same way in seconds, logging uncertainty is visible, unsafe intake always reaches a person, and the note cannot drop a flag. Whether it saves the coach time is not yet shown.</w:t>
+      </w:r>
+    </w:p>
+    <w:p>
+      <w:r>
+        <w:rPr>
+          <w:b/>
+          <w:sz w:val="20"/>
+        </w:rPr>
+        <w:t>Next: calibrate TDEE from weigh-ins.</w:t>
+      </w:r>
+      <w:r>
+        <w:rPr>
+          <w:sz w:val="20"/>
+        </w:rPr>
+        <w:t xml:space="preserve"> The weakest number is TDEE — a formula times a self-reported activity factor. If the gym's scale logged weekly weights, the trend against logged intake would reveal each client's real expenditure within a month, assuming their logging bias is stable. Weigh-ins recorded by the gym, not reported by the client, are a label the world supplies for free — the first step from an efficiency tool towards one that learns. The test: does calibrated TDEE predict next week's weight better than the formula?</w:t>
+      </w:r>
+    </w:p>
+    <w:p>
       <w:r>
         <w:rPr>
           <w:i/>

</xml_diff>

<commit_message>
Add live Streamlit Cloud URL to README, product doc and report
</commit_message>
<xml_diff>
--- a/docs/PE6201_Tradeoff_Analysis_LIU_ZEYUAN.docx
+++ b/docs/PE6201_Tradeoff_Analysis_LIU_ZEYUAN.docx
@@ -28,6 +28,20 @@
           <w:u w:val="single"/>
         </w:rPr>
         <w:t>github.com/Lizzy-808/coachfit-cut-assistant</w:t>
+      </w:r>
+      <w:r>
+        <w:rPr>
+          <w:sz w:val="19"/>
+        </w:rPr>
+        <w:t xml:space="preserve"> · Live: </w:t>
+      </w:r>
+      <w:r>
+        <w:rPr>
+          <w:color w:val="1F5FA8"/>
+          <w:sz w:val="19"/>
+          <w:u w:val="single"/>
+        </w:rPr>
+        <w:t>coachfit-cut-assistant.streamlit.app</w:t>
       </w:r>
     </w:p>
     <w:p>

</xml_diff>

<commit_message>
Word export: clickable hyperlinks and explicit table borders
</commit_message>
<xml_diff>
--- a/docs/PE6201_Tradeoff_Analysis_LIU_ZEYUAN.docx
+++ b/docs/PE6201_Tradeoff_Analysis_LIU_ZEYUAN.docx
@@ -21,28 +21,32 @@
         </w:rPr>
         <w:t xml:space="preserve">LIU ZEYUAN · PE6201 Section B · End-of-Course Project · Code: </w:t>
       </w:r>
-      <w:r>
-        <w:rPr>
-          <w:color w:val="1F5FA8"/>
-          <w:sz w:val="19"/>
-          <w:u w:val="single"/>
-        </w:rPr>
-        <w:t>github.com/Lizzy-808/coachfit-cut-assistant</w:t>
-      </w:r>
+      <w:hyperlink r:id="rId9">
+        <w:r>
+          <w:rPr>
+            <w:color w:val="1F5FA8"/>
+            <w:u w:val="single"/>
+            <w:sz w:val="19"/>
+          </w:rPr>
+          <w:t>github.com/Lizzy-808/coachfit-cut-assistant</w:t>
+        </w:r>
+      </w:hyperlink>
       <w:r>
         <w:rPr>
           <w:sz w:val="19"/>
         </w:rPr>
         <w:t xml:space="preserve"> · Live: </w:t>
       </w:r>
-      <w:r>
-        <w:rPr>
-          <w:color w:val="1F5FA8"/>
-          <w:sz w:val="19"/>
-          <w:u w:val="single"/>
-        </w:rPr>
-        <w:t>coachfit-cut-assistant.streamlit.app</w:t>
-      </w:r>
+      <w:hyperlink r:id="rId10">
+        <w:r>
+          <w:rPr>
+            <w:color w:val="1F5FA8"/>
+            <w:u w:val="single"/>
+            <w:sz w:val="19"/>
+          </w:rPr>
+          <w:t>coachfit-cut-assistant.streamlit.app</w:t>
+        </w:r>
+      </w:hyperlink>
     </w:p>
     <w:p>
       <w:pPr>
@@ -106,8 +110,16 @@
       <w:tblPr>
         <w:tblStyle w:val="TableGrid"/>
         <w:tblW w:type="auto" w:w="0"/>
+        <w:tblLook w:firstColumn="1" w:firstRow="1" w:lastColumn="0" w:lastRow="0" w:noHBand="0" w:noVBand="1" w:val="04A0"/>
         <w:jc w:val="center"/>
-        <w:tblLook w:firstColumn="1" w:firstRow="1" w:lastColumn="0" w:lastRow="0" w:noHBand="0" w:noVBand="1" w:val="04A0"/>
+        <w:tblBorders>
+          <w:top w:val="single" w:sz="4" w:space="0" w:color="B8C2CC"/>
+          <w:left w:val="single" w:sz="4" w:space="0" w:color="B8C2CC"/>
+          <w:bottom w:val="single" w:sz="4" w:space="0" w:color="B8C2CC"/>
+          <w:right w:val="single" w:sz="4" w:space="0" w:color="B8C2CC"/>
+          <w:insideH w:val="single" w:sz="4" w:space="0" w:color="B8C2CC"/>
+          <w:insideV w:val="single" w:sz="4" w:space="0" w:color="B8C2CC"/>
+        </w:tblBorders>
       </w:tblPr>
       <w:tblGrid>
         <w:gridCol w:w="2438"/>
@@ -601,8 +613,16 @@
       <w:tblPr>
         <w:tblStyle w:val="TableGrid"/>
         <w:tblW w:type="auto" w:w="0"/>
+        <w:tblLook w:firstColumn="1" w:firstRow="1" w:lastColumn="0" w:lastRow="0" w:noHBand="0" w:noVBand="1" w:val="04A0"/>
         <w:jc w:val="center"/>
-        <w:tblLook w:firstColumn="1" w:firstRow="1" w:lastColumn="0" w:lastRow="0" w:noHBand="0" w:noVBand="1" w:val="04A0"/>
+        <w:tblBorders>
+          <w:top w:val="single" w:sz="4" w:space="0" w:color="B8C2CC"/>
+          <w:left w:val="single" w:sz="4" w:space="0" w:color="B8C2CC"/>
+          <w:bottom w:val="single" w:sz="4" w:space="0" w:color="B8C2CC"/>
+          <w:right w:val="single" w:sz="4" w:space="0" w:color="B8C2CC"/>
+          <w:insideH w:val="single" w:sz="4" w:space="0" w:color="B8C2CC"/>
+          <w:insideV w:val="single" w:sz="4" w:space="0" w:color="B8C2CC"/>
+        </w:tblBorders>
       </w:tblPr>
       <w:tblGrid>
         <w:gridCol w:w="3251"/>

</xml_diff>